<commit_message>
Add official 31-province data calibration package
</commit_message>
<xml_diff>
--- a/editor_response/01_Response_to_Editor_DRAFT.docx
+++ b/editor_response/01_Response_to_Editor_DRAFT.docx
@@ -229,7 +229,7 @@
           <w:color w:val="1F1F1F"/>
           <w:sz w:val="22"/>
         </w:rPr>
-        <w:t>Replacement supplied: `03_Reconstructed_31_Province_Inputs.xlsx` and the CSV tables in `data/reconstructed/`. The workbook exposes 31 region rows, all 248 region-sector-mode records, the 4 x 2 coefficient tables, national constraints, variable definitions, source mapping, and QC formulas. Every replacement value is labelled `calibrated reconstruction; not historical author input`.</w:t>
+        <w:t>Replacement supplied: `03_Reconstructed_31_Province_Inputs.xlsx`, `06_PUBLIC_DATA_AND_REVERSE_CALIBRATION_METHOD.md`, and the CSV tables in `data/source/` and `data/reconstructed/`. The workbook now separates (i) direct 2024 observations transcribed for all 31 province-level regions from six official NBS yearbook tables and (ii) the processed/calibrated fields used to create all 248 region-sector-mode records. It includes the four production sectors, population, disposable income, wastewater pressure, freight, e-commerce, model coefficients, national constraints, formulas and QC checks.</w:t>
       </w:r>
     </w:p>
     <w:p>
@@ -243,7 +243,7 @@
           <w:color w:val="1F1F1F"/>
           <w:sz w:val="22"/>
         </w:rPr>
-        <w:t>The province names follow the standard 31-province NBS ordering solely to make the replacement inspectable. The article does not disclose the original mapping between r01-r31 and province names, so this mapping is an explicit reconstruction assumption.</w:t>
+        <w:t>Direct observations are labelled `official public 2024 NBS transcription; not historical author input`; transformations and assumptions are labelled `calibrated reconstruction; not historical author input`. The province names follow the standard NBS ordering to make the replacement inspectable. The article does not disclose the original mapping between r01-r31 and province names, so that mapping remains an explicit reconstruction assumption.</w:t>
       </w:r>
     </w:p>
     <w:p>
@@ -279,7 +279,7 @@
           <w:color w:val="1F1F1F"/>
           <w:sz w:val="22"/>
         </w:rPr>
-        <w:t>Replacement supplied: `data/source/` contains exact transcriptions of article Tables 1-4 and later official public-source extracts from the Ministry of Agriculture and Rural Affairs, the World Bank/FAO, and the documented NBS A0407 indicator. These files support independent plausibility checks but are not claimed to be the original data files used for the reported experiment.</w:t>
+        <w:t>Replacement supplied: `data/source/` contains exact transcriptions of article Tables 1-4, Ministry and World Bank/FAO extracts, and `nbs_2024_31_province_public_panel.csv`. The new panel transcribes six official China Statistical Yearbook 2025 tables for all 31 province-level regions: aquatic-product output, population, disposable income, wastewater pollutants, freight, and enterprise e-commerce. Its adjacent data dictionary retains every printed unit and direct official URL. These public files support independent plausibility checks and transparent rerunning but are not claimed to be the contemporaneous files used for the reported experiment.</w:t>
       </w:r>
     </w:p>
     <w:p>
@@ -293,7 +293,7 @@
           <w:color w:val="1F1F1F"/>
           <w:sz w:val="22"/>
         </w:rPr>
-        <w:t>The NBS A0407 official page returned HTTP 403 during a renewed access check on 11 September 2026. No province values were copied from paywalled or unverified third-party aggregators. The official statistical-system description states that annual fishery results are published through the China Fisheries Statistical Yearbook; the underlying yearbook extraction used historically is not retained in the available archive.</w:t>
+        <w:t>The former NBS A0407 portal endpoint returned HTTP 403 during a renewed automated check. We therefore used directly accessible official yearbook tables instead of third-party aggregators. Table 12-15 supplies the 2024 marine/freshwater and capture/aquaculture output required for a real 31-province production backbone. The temporal calibration to the paper's 2023 total, the fresh-sales/deep-processing split, and all external proxy transformations are documented formula by formula in `06_PUBLIC_DATA_AND_REVERSE_CALIBRATION_METHOD.md`.</w:t>
       </w:r>
     </w:p>
     <w:p>
@@ -375,7 +375,7 @@
           <w:color w:val="1F1F1F"/>
           <w:sz w:val="22"/>
         </w:rPr>
-        <w:t>The new surrogate experiment uses 48 individuals and 30 generations to provide a practical, fully executable audit path. It does not reproduce the article's 200-individual, 1,000-generation historical experiment, because the missing historical province inputs and metric-reference definitions are necessary for a strict rerun.</w:t>
+        <w:t>The new surrogate experiment uses the official NBS 2024 province-sector pattern, reverse-calibrated to the paper's disclosed 2023 national total, plus explicitly labelled processing/marketing/social/economic/ecological proxies. It uses 48 individuals and 30 generations to provide a practical, fully executable audit path. It does not reproduce the article's 200-individual, 1,000-generation historical experiment, because the missing historical province inputs and metric-reference definitions are necessary for a strict rerun.</w:t>
       </w:r>
     </w:p>
     <w:p>
@@ -700,7 +700,7 @@
                 <w:color w:val="1F1F1F"/>
                 <w:sz w:val="19"/>
               </w:rPr>
-              <w:t>Reconstructed XLSX + five CSV tables</w:t>
+              <w:t>Official 31-province panel + reconstructed XLSX/CSV + derivation equations</w:t>
             </w:r>
           </w:p>
         </w:tc>
@@ -774,7 +774,7 @@
                 <w:color w:val="1F1F1F"/>
                 <w:sz w:val="19"/>
               </w:rPr>
-              <w:t>Article transcriptions + official public extracts + source catalogue</w:t>
+              <w:t>Six NBS tables + article/Ministry/World Bank extracts + source catalogue</w:t>
             </w:r>
           </w:p>
         </w:tc>
@@ -979,18 +979,6 @@
     </w:p>
     <w:p>
       <w:pPr>
-        <w:sectPr>
-          <w:headerReference w:type="default" r:id="rId9"/>
-          <w:footerReference w:type="default" r:id="rId10"/>
-          <w:pgSz w:w="12240" w:h="15840"/>
-          <w:pgMar w:top="1440" w:right="1440" w:bottom="1440" w:left="1440" w:header="708" w:footer="708" w:gutter="0"/>
-          <w:cols w:space="720"/>
-          <w:docGrid w:linePitch="360"/>
-        </w:sectPr>
-      </w:pPr>
-    </w:p>
-    <w:p>
-      <w:pPr>
         <w:pStyle w:val="Heading1"/>
       </w:pPr>
       <w:r>
@@ -1058,10 +1046,60 @@
           <w:color w:val="1F1F1F"/>
           <w:sz w:val="22"/>
         </w:rPr>
+        <w:t>National Bureau of Statistics, China Statistical Yearbook 2025 navigation: https://www.stats.gov.cn/sj/ndsj/2025/left_.htm</w:t>
+      </w:r>
+    </w:p>
+    <w:p>
+      <w:pPr>
+        <w:pStyle w:val="ListBullet"/>
+        <w:spacing w:after="60" w:line="252" w:lineRule="auto"/>
+        <w:ind w:left="720" w:hanging="360"/>
+      </w:pPr>
+      <w:r>
+        <w:rPr>
+          <w:rFonts w:ascii="Calibri" w:hAnsi="Calibri"/>
+          <w:i w:val="0"/>
+          <w:color w:val="1F1F1F"/>
+          <w:sz w:val="22"/>
+        </w:rPr>
+        <w:t>NBS Table 12-15, Output of Aquatic Products: https://www.stats.gov.cn/sj/ndsj/2025/html/E12-15.jpg</w:t>
+      </w:r>
+    </w:p>
+    <w:p>
+      <w:pPr>
+        <w:pStyle w:val="ListBullet"/>
+        <w:spacing w:after="60" w:line="252" w:lineRule="auto"/>
+        <w:ind w:left="720" w:hanging="360"/>
+      </w:pPr>
+      <w:r>
+        <w:rPr>
+          <w:rFonts w:ascii="Calibri" w:hAnsi="Calibri"/>
+          <w:i w:val="0"/>
+          <w:color w:val="1F1F1F"/>
+          <w:sz w:val="22"/>
+        </w:rPr>
+        <w:t>NBS Tables 2-5, 6-18, 8-10, 16-13 and 16-39: https://www.stats.gov.cn/sj/ndsj/2025/html/E02-05.jpg ; https://www.stats.gov.cn/sj/ndsj/2025/html/E06-18.jpg ; https://www.stats.gov.cn/sj/ndsj/2025/html/E08-10.jpg ; https://www.stats.gov.cn/sj/ndsj/2025/html/E16-13.jpg ; https://www.stats.gov.cn/sj/ndsj/2025/html/E16-39.jpg</w:t>
+      </w:r>
+    </w:p>
+    <w:p>
+      <w:pPr>
+        <w:pStyle w:val="ListBullet"/>
+        <w:spacing w:after="60" w:line="252" w:lineRule="auto"/>
+        <w:ind w:left="720" w:hanging="360"/>
+      </w:pPr>
+      <w:r>
+        <w:rPr>
+          <w:rFonts w:ascii="Calibri" w:hAnsi="Calibri"/>
+          <w:i w:val="0"/>
+          <w:color w:val="1F1F1F"/>
+          <w:sz w:val="22"/>
+        </w:rPr>
         <w:t>Repository and code archive: https://github.com/niqundaye/Frontiers-in-Marine-Science</w:t>
       </w:r>
     </w:p>
     <w:sectPr>
+      <w:headerReference w:type="default" r:id="rId9"/>
+      <w:footerReference w:type="default" r:id="rId10"/>
       <w:pgSz w:w="12240" w:h="15840"/>
       <w:pgMar w:top="1440" w:right="1440" w:bottom="1440" w:left="1440" w:header="708" w:footer="708" w:gutter="0"/>
       <w:cols w:space="720"/>

</xml_diff>